<commit_message>
Extend Review 3 to 8/10 modules: Severity Scoring, Findings Store, Remediation Generation
</commit_message>
<xml_diff>
--- a/docs/Report_Ch1-4_RAG_VulnDetection.docx
+++ b/docs/Report_Ch1-4_RAG_VulnDetection.docx
@@ -5670,7 +5670,7 @@
     </w:p>
     <w:bookmarkEnd w:id="70"/>
     <w:bookmarkEnd w:id="71"/>
-    <w:bookmarkStart w:id="97" w:name="chapter-4-implementation-and-results"/>
+    <w:bookmarkStart w:id="98" w:name="chapter-4-implementation-and-results"/>
     <w:p>
       <w:pPr>
         <w:pStyle w:val="Heading1"/>
@@ -5693,7 +5693,25 @@
         <w:pStyle w:val="FirstParagraph"/>
       </w:pPr>
       <w:r>
-        <w:t xml:space="preserve">Following the work plan in §3.6, Review 3 targets five of the ten modules from §3.3 — Repository Ingestion, Parsing &amp; Chunking, Embedding Service, Security Knowledge Base, and the RAG Retrieval Orchestrator (dual-context retrieval only, without the downstream LLM analysis/severity/remediation stages, which are Review 4/5 scope). All five have been implemented in Python, run against a real public repository, and covered by an automated test suite. Source code lives under</w:t>
+        <w:t xml:space="preserve">Following the work plan in §3.6, Review 3 targets eight of the ten modules from §3.3 — Repository Ingestion, Parsing &amp; Chunking, Embedding Service, Security Knowledge Base, the RAG Retrieval Orchestrator, Severity Scoring, a Findings Store, and Remediation Generation. Only LLM Security Analysis (the confirmation</w:t>
+      </w:r>
+      <w:r>
+        <w:t xml:space="preserve"> </w:t>
+      </w:r>
+      <w:r>
+        <w:t xml:space="preserve">“</w:t>
+      </w:r>
+      <w:r>
+        <w:t xml:space="preserve">verdict</w:t>
+      </w:r>
+      <w:r>
+        <w:t xml:space="preserve">”</w:t>
+      </w:r>
+      <w:r>
+        <w:t xml:space="preserve"> </w:t>
+      </w:r>
+      <w:r>
+        <w:t xml:space="preserve">step) and the Dashboard remain out of scope for this review — both explicitly for the reason given in §4.8, not for lack of time. All eight implemented modules run in Python, have been exercised end-to-end against a real public repository, and are covered by an automated test suite (32 tests, §4.5). Source code lives under</w:t>
       </w:r>
       <w:r>
         <w:t xml:space="preserve"> </w:t>
@@ -5999,31 +6017,34 @@
               <w:jc w:val="left"/>
             </w:pPr>
             <w:r>
-              <w:t xml:space="preserve">LLM Security Analysis</w:t>
-            </w:r>
-          </w:p>
-        </w:tc>
-        <w:tc>
-          <w:tcPr/>
-          <w:p>
-            <w:pPr>
-              <w:pStyle w:val="Compact"/>
-              <w:jc w:val="left"/>
-            </w:pPr>
-            <w:r>
-              <w:t xml:space="preserve">—</w:t>
-            </w:r>
-          </w:p>
-        </w:tc>
-        <w:tc>
-          <w:tcPr/>
-          <w:p>
-            <w:pPr>
-              <w:pStyle w:val="Compact"/>
-              <w:jc w:val="left"/>
-            </w:pPr>
-            <w:r>
-              <w:t xml:space="preserve">Review 4 scope, not started</w:t>
+              <w:t xml:space="preserve">Severity Scoring</w:t>
+            </w:r>
+          </w:p>
+        </w:tc>
+        <w:tc>
+          <w:tcPr/>
+          <w:p>
+            <w:pPr>
+              <w:pStyle w:val="Compact"/>
+              <w:jc w:val="left"/>
+            </w:pPr>
+            <w:r>
+              <w:rPr>
+                <w:rStyle w:val="VerbatimChar"/>
+              </w:rPr>
+              <w:t xml:space="preserve">severity/scorer.py</w:t>
+            </w:r>
+          </w:p>
+        </w:tc>
+        <w:tc>
+          <w:tcPr/>
+          <w:p>
+            <w:pPr>
+              <w:pStyle w:val="Compact"/>
+              <w:jc w:val="left"/>
+            </w:pPr>
+            <w:r>
+              <w:t xml:space="preserve">Implemented — rule-based/CVSS-inspired, confidence-calibrated (§4.8)</w:t>
             </w:r>
           </w:p>
         </w:tc>
@@ -6037,31 +6058,34 @@
               <w:jc w:val="left"/>
             </w:pPr>
             <w:r>
-              <w:t xml:space="preserve">Severity Scoring</w:t>
-            </w:r>
-          </w:p>
-        </w:tc>
-        <w:tc>
-          <w:tcPr/>
-          <w:p>
-            <w:pPr>
-              <w:pStyle w:val="Compact"/>
-              <w:jc w:val="left"/>
-            </w:pPr>
-            <w:r>
-              <w:t xml:space="preserve">—</w:t>
-            </w:r>
-          </w:p>
-        </w:tc>
-        <w:tc>
-          <w:tcPr/>
-          <w:p>
-            <w:pPr>
-              <w:pStyle w:val="Compact"/>
-              <w:jc w:val="left"/>
-            </w:pPr>
-            <w:r>
-              <w:t xml:space="preserve">Review 4 scope, not started</w:t>
+              <w:t xml:space="preserve">Findings Store</w:t>
+            </w:r>
+          </w:p>
+        </w:tc>
+        <w:tc>
+          <w:tcPr/>
+          <w:p>
+            <w:pPr>
+              <w:pStyle w:val="Compact"/>
+              <w:jc w:val="left"/>
+            </w:pPr>
+            <w:r>
+              <w:rPr>
+                <w:rStyle w:val="VerbatimChar"/>
+              </w:rPr>
+              <w:t xml:space="preserve">findings_store/store.py</w:t>
+            </w:r>
+          </w:p>
+        </w:tc>
+        <w:tc>
+          <w:tcPr/>
+          <w:p>
+            <w:pPr>
+              <w:pStyle w:val="Compact"/>
+              <w:jc w:val="left"/>
+            </w:pPr>
+            <w:r>
+              <w:t xml:space="preserve">Implemented — SQLite, a documented substitute for MongoDB (§4.8)</w:t>
             </w:r>
           </w:p>
         </w:tc>
@@ -6087,19 +6111,22 @@
               <w:jc w:val="left"/>
             </w:pPr>
             <w:r>
-              <w:t xml:space="preserve">—</w:t>
-            </w:r>
-          </w:p>
-        </w:tc>
-        <w:tc>
-          <w:tcPr/>
-          <w:p>
-            <w:pPr>
-              <w:pStyle w:val="Compact"/>
-              <w:jc w:val="left"/>
-            </w:pPr>
-            <w:r>
-              <w:t xml:space="preserve">Review 5 scope, not started</w:t>
+              <w:rPr>
+                <w:rStyle w:val="VerbatimChar"/>
+              </w:rPr>
+              <w:t xml:space="preserve">remediation/generator.py</w:t>
+            </w:r>
+          </w:p>
+        </w:tc>
+        <w:tc>
+          <w:tcPr/>
+          <w:p>
+            <w:pPr>
+              <w:pStyle w:val="Compact"/>
+              <w:jc w:val="left"/>
+            </w:pPr>
+            <w:r>
+              <w:t xml:space="preserve">Implemented — template-based, CWE-keyed, 7/25 CWE categories covered (§4.8)</w:t>
             </w:r>
           </w:p>
         </w:tc>
@@ -6113,7 +6140,7 @@
               <w:jc w:val="left"/>
             </w:pPr>
             <w:r>
-              <w:t xml:space="preserve">Findings Store (MongoDB)</w:t>
+              <w:t xml:space="preserve">LLM Security Analysis</w:t>
             </w:r>
           </w:p>
         </w:tc>
@@ -6137,7 +6164,7 @@
               <w:jc w:val="left"/>
             </w:pPr>
             <w:r>
-              <w:t xml:space="preserve">Review 4 scope, not started</w:t>
+              <w:t xml:space="preserve">Not started — needs a provisioned LLM API, unavailable in this build environment (§4.8)</w:t>
             </w:r>
           </w:p>
         </w:tc>
@@ -6175,7 +6202,7 @@
               <w:jc w:val="left"/>
             </w:pPr>
             <w:r>
-              <w:t xml:space="preserve">Review 5 scope, not started</w:t>
+              <w:t xml:space="preserve">Not started — deferred to keep this sprint’s scope to the modules above</w:t>
             </w:r>
           </w:p>
         </w:tc>
@@ -6186,7 +6213,7 @@
         <w:pStyle w:val="BodyText"/>
       </w:pPr>
       <w:r>
-        <w:t xml:space="preserve">This is 5 of 10 designed modules working end-to-end against real code, matching the</w:t>
+        <w:t xml:space="preserve">This is 8 of 10 designed modules working end-to-end against real code — ahead of the</w:t>
       </w:r>
       <w:r>
         <w:t xml:space="preserve"> </w:t>
@@ -6204,7 +6231,7 @@
         <w:t xml:space="preserve"> </w:t>
       </w:r>
       <w:r>
-        <w:t xml:space="preserve">commitment made at Review 2 (§3.6).</w:t>
+        <w:t xml:space="preserve">commitment made at Review 2 (§3.6). The three added this sprint (Severity Scoring, Findings Store, Remediation Generation) are described in full, including two honest technology substitutions, in §4.8.</w:t>
       </w:r>
     </w:p>
     <w:bookmarkEnd w:id="72"/>
@@ -7238,13 +7265,13 @@
         <w:pStyle w:val="FirstParagraph"/>
       </w:pPr>
       <w:r>
-        <w:t xml:space="preserve">Seven automated tests (</w:t>
+        <w:t xml:space="preserve">32 automated tests (</w:t>
       </w:r>
       <w:r>
         <w:rPr>
           <w:rStyle w:val="VerbatimChar"/>
         </w:rPr>
-        <w:t xml:space="preserve">src/tests/test_pipeline.py</w:t>
+        <w:t xml:space="preserve">src/tests/</w:t>
       </w:r>
       <w:r>
         <w:t xml:space="preserve">, run with</w:t>
@@ -7259,89 +7286,7 @@
         <w:t xml:space="preserve">pytest</w:t>
       </w:r>
       <w:r>
-        <w:t xml:space="preserve">) cover: the Python and JavaScript chunkers correctly identifying function/class boundaries and names, the identifier tokenizer correctly splitting camelCase/snake_case, embeddings being unit-normalised, the FAISS vector store’s save/load round-trip preserving both vectors and metadata, the knowledge base loading all 35 entries, and the SQL-injection sanity check retrieving</w:t>
-      </w:r>
-      <w:r>
-        <w:t xml:space="preserve"> </w:t>
-      </w:r>
-      <w:r>
-        <w:rPr>
-          <w:rStyle w:val="VerbatimChar"/>
-        </w:rPr>
-        <w:t xml:space="preserve">CWE-89</w:t>
-      </w:r>
-      <w:r>
-        <w:t xml:space="preserve"> </w:t>
-      </w:r>
-      <w:r>
-        <w:t xml:space="preserve">at rank 1. All seven pass. This is offered as executable evidence of correctness, attributable to this team’s code, per the Implementation rubric criterion, not as a claim without support.</w:t>
-      </w:r>
-    </w:p>
-    <w:bookmarkEnd w:id="85"/>
-    <w:bookmarkStart w:id="86" w:name="action-taken-on-review-2-panel-feedback"/>
-    <w:p>
-      <w:pPr>
-        <w:pStyle w:val="Heading2"/>
-      </w:pPr>
-      <w:r>
-        <w:t xml:space="preserve">4.6 Action Taken on Review 2 Panel Feedback</w:t>
-      </w:r>
-    </w:p>
-    <w:p>
-      <w:pPr>
-        <w:pStyle w:val="FirstParagraph"/>
-      </w:pPr>
-      <w:r>
-        <w:rPr>
-          <w:iCs/>
-          <w:i/>
-        </w:rPr>
-        <w:t xml:space="preserve">[To be completed once the Review 2 panel’s written comments are available — this section will map each comment to the specific change made in response, per the course’s general guideline that</w:t>
-      </w:r>
-      <w:r>
-        <w:rPr>
-          <w:iCs/>
-          <w:i/>
-        </w:rPr>
-        <w:t xml:space="preserve"> </w:t>
-      </w:r>
-      <w:r>
-        <w:rPr>
-          <w:iCs/>
-          <w:i/>
-        </w:rPr>
-        <w:t xml:space="preserve">“</w:t>
-      </w:r>
-      <w:r>
-        <w:rPr>
-          <w:iCs/>
-          <w:i/>
-        </w:rPr>
-        <w:t xml:space="preserve">all review comments and suggestions shall be recorded, and the action taken shall be presented during the subsequent review.</w:t>
-      </w:r>
-      <w:r>
-        <w:rPr>
-          <w:iCs/>
-          <w:i/>
-        </w:rPr>
-        <w:t xml:space="preserve">”</w:t>
-      </w:r>
-      <w:r>
-        <w:rPr>
-          <w:iCs/>
-          <w:i/>
-        </w:rPr>
-        <w:t xml:space="preserve">]</w:t>
-      </w:r>
-    </w:p>
-    <w:bookmarkEnd w:id="86"/>
-    <w:bookmarkStart w:id="87" w:name="limitations-and-next-steps-into-review-4"/>
-    <w:p>
-      <w:pPr>
-        <w:pStyle w:val="Heading2"/>
-      </w:pPr>
-      <w:r>
-        <w:t xml:space="preserve">4.7 Limitations and Next Steps (into Review 4)</w:t>
+        <w:t xml:space="preserve">) cover every implemented module, one file per module:</w:t>
       </w:r>
     </w:p>
     <w:p>
@@ -7353,7 +7298,31 @@
         <w:pStyle w:val="Compact"/>
       </w:pPr>
       <w:r>
-        <w:t xml:space="preserve">The embedding backbone (§4.2) is a documented, swappable substitute for the code-specialised transformer named in Chapter 3; Review 4 should attempt that swap and re-run §4.4’s exact benchmark to measure the improvement.</w:t>
+        <w:rPr>
+          <w:rStyle w:val="VerbatimChar"/>
+        </w:rPr>
+        <w:t xml:space="preserve">test_pipeline.py</w:t>
+      </w:r>
+      <w:r>
+        <w:t xml:space="preserve"> </w:t>
+      </w:r>
+      <w:r>
+        <w:t xml:space="preserve">(7 tests, unchanged from the prior sprint): the Python and JavaScript chunkers correctly identifying function/class boundaries and names, the identifier tokenizer correctly splitting camelCase/snake_case, embeddings being unit-normalised, the FAISS vector store’s save/load round-trip preserving both vectors and metadata, the knowledge base loading all 35 entries, and the SQL-injection sanity check retrieving</w:t>
+      </w:r>
+      <w:r>
+        <w:t xml:space="preserve"> </w:t>
+      </w:r>
+      <w:r>
+        <w:rPr>
+          <w:rStyle w:val="VerbatimChar"/>
+        </w:rPr>
+        <w:t xml:space="preserve">CWE-89</w:t>
+      </w:r>
+      <w:r>
+        <w:t xml:space="preserve"> </w:t>
+      </w:r>
+      <w:r>
+        <w:t xml:space="preserve">at rank 1.</w:t>
       </w:r>
     </w:p>
     <w:p>
@@ -7365,22 +7334,34 @@
         <w:pStyle w:val="Compact"/>
       </w:pPr>
       <w:r>
-        <w:t xml:space="preserve">Chunking currently treats a</w:t>
-      </w:r>
-      <w:r>
-        <w:t xml:space="preserve"> </w:t>
-      </w:r>
-      <w:r>
         <w:rPr>
           <w:rStyle w:val="VerbatimChar"/>
         </w:rPr>
-        <w:t xml:space="preserve">module.exports = function(){...}</w:t>
-      </w:r>
-      <w:r>
-        <w:t xml:space="preserve"> </w:t>
-      </w:r>
-      <w:r>
-        <w:t xml:space="preserve">wrapper as one chunk; splitting on inner method definitions would reduce chunk-size variance for older CommonJS-style code (§4.3).</w:t>
+        <w:t xml:space="preserve">test_severity.py</w:t>
+      </w:r>
+      <w:r>
+        <w:t xml:space="preserve"> </w:t>
+      </w:r>
+      <w:r>
+        <w:t xml:space="preserve">(10 tests, new): correct band/score lookup for both CWE and OWASP-category matches, the margin-based confidence downgrade triggering below threshold and not above it, the</w:t>
+      </w:r>
+      <w:r>
+        <w:t xml:space="preserve"> </w:t>
+      </w:r>
+      <w:r>
+        <w:t xml:space="preserve">“</w:t>
+      </w:r>
+      <w:r>
+        <w:t xml:space="preserve">Low</w:t>
+      </w:r>
+      <w:r>
+        <w:t xml:space="preserve">”</w:t>
+      </w:r>
+      <w:r>
+        <w:t xml:space="preserve"> </w:t>
+      </w:r>
+      <w:r>
+        <w:t xml:space="preserve">band correctly flooring rather than going negative, the single-hit (no top-2) case defaulting to full confidence, and every entry in both severity tables having a valid CVSS-range score and band.</w:t>
       </w:r>
     </w:p>
     <w:p>
@@ -7392,43 +7373,16 @@
         <w:pStyle w:val="Compact"/>
       </w:pPr>
       <w:r>
-        <w:t xml:space="preserve">The access-control CWE family (§4.4) is the clearest, most specific target for the LLM reasoning layer’s first use: distinguishing</w:t>
-      </w:r>
-      <w:r>
-        <w:t xml:space="preserve"> </w:t>
-      </w:r>
-      <w:r>
-        <w:t xml:space="preserve">“</w:t>
-      </w:r>
-      <w:r>
-        <w:t xml:space="preserve">no check present</w:t>
-      </w:r>
-      <w:r>
-        <w:t xml:space="preserve">”</w:t>
-      </w:r>
-      <w:r>
-        <w:t xml:space="preserve"> </w:t>
-      </w:r>
-      <w:r>
-        <w:t xml:space="preserve">from</w:t>
-      </w:r>
-      <w:r>
-        <w:t xml:space="preserve"> </w:t>
-      </w:r>
-      <w:r>
-        <w:t xml:space="preserve">“</w:t>
-      </w:r>
-      <w:r>
-        <w:t xml:space="preserve">check present but wrong,</w:t>
-      </w:r>
-      <w:r>
-        <w:t xml:space="preserve">”</w:t>
-      </w:r>
-      <w:r>
-        <w:t xml:space="preserve"> </w:t>
-      </w:r>
-      <w:r>
-        <w:t xml:space="preserve">which the current retrieval-only baseline cannot do.</w:t>
+        <w:rPr>
+          <w:rStyle w:val="VerbatimChar"/>
+        </w:rPr>
+        <w:t xml:space="preserve">test_findings_store.py</w:t>
+      </w:r>
+      <w:r>
+        <w:t xml:space="preserve"> </w:t>
+      </w:r>
+      <w:r>
+        <w:t xml:space="preserve">(7 tests, new): schema creation, insert/query round-trip (including the JSON-encoded retrieved-context field), filtering by repo/severity, per-severity aggregate counts, and per-repo deletion (used to avoid duplicate rows on re-scan) — all against a temporary on-disk SQLite file per test, not a shared database.</w:t>
       </w:r>
     </w:p>
     <w:p>
@@ -7440,6 +7394,574 @@
         <w:pStyle w:val="Compact"/>
       </w:pPr>
       <w:r>
+        <w:rPr>
+          <w:rStyle w:val="VerbatimChar"/>
+        </w:rPr>
+        <w:t xml:space="preserve">test_remediation.py</w:t>
+      </w:r>
+      <w:r>
+        <w:t xml:space="preserve"> </w:t>
+      </w:r>
+      <w:r>
+        <w:t xml:space="preserve">(8 tests, new): each of the 7 templated CWE categories produces a non-empty, genuinely different before/after pair, an unknown or</w:t>
+      </w:r>
+      <w:r>
+        <w:t xml:space="preserve"> </w:t>
+      </w:r>
+      <w:r>
+        <w:rPr>
+          <w:rStyle w:val="VerbatimChar"/>
+        </w:rPr>
+        <w:t xml:space="preserve">None</w:t>
+      </w:r>
+      <w:r>
+        <w:t xml:space="preserve"> </w:t>
+      </w:r>
+      <w:r>
+        <w:t xml:space="preserve">CWE ID returns</w:t>
+      </w:r>
+      <w:r>
+        <w:t xml:space="preserve"> </w:t>
+      </w:r>
+      <w:r>
+        <w:rPr>
+          <w:rStyle w:val="VerbatimChar"/>
+        </w:rPr>
+        <w:t xml:space="preserve">None</w:t>
+      </w:r>
+      <w:r>
+        <w:t xml:space="preserve"> </w:t>
+      </w:r>
+      <w:r>
+        <w:t xml:space="preserve">rather than guessing, and every CWE explicitly documented as</w:t>
+      </w:r>
+      <w:r>
+        <w:t xml:space="preserve"> </w:t>
+      </w:r>
+      <w:r>
+        <w:t xml:space="preserve">“</w:t>
+      </w:r>
+      <w:r>
+        <w:t xml:space="preserve">no template available</w:t>
+      </w:r>
+      <w:r>
+        <w:t xml:space="preserve">”</w:t>
+      </w:r>
+      <w:r>
+        <w:t xml:space="preserve"> </w:t>
+      </w:r>
+      <w:r>
+        <w:t xml:space="preserve">(§4.8) does in fact return</w:t>
+      </w:r>
+      <w:r>
+        <w:t xml:space="preserve"> </w:t>
+      </w:r>
+      <w:r>
+        <w:rPr>
+          <w:rStyle w:val="VerbatimChar"/>
+        </w:rPr>
+        <w:t xml:space="preserve">None</w:t>
+      </w:r>
+      <w:r>
+        <w:t xml:space="preserve">.</w:t>
+      </w:r>
+    </w:p>
+    <w:p>
+      <w:pPr>
+        <w:pStyle w:val="FirstParagraph"/>
+      </w:pPr>
+      <w:r>
+        <w:t xml:space="preserve">All 32 pass. This is offered as executable evidence of correctness, attributable to this team’s code, per the Implementation rubric criterion, not as a claim without support.</w:t>
+      </w:r>
+    </w:p>
+    <w:bookmarkEnd w:id="85"/>
+    <w:bookmarkStart w:id="86" w:name="action-taken-on-review-2-panel-feedback"/>
+    <w:p>
+      <w:pPr>
+        <w:pStyle w:val="Heading2"/>
+      </w:pPr>
+      <w:r>
+        <w:t xml:space="preserve">4.6 Action Taken on Review 2 Panel Feedback</w:t>
+      </w:r>
+    </w:p>
+    <w:p>
+      <w:pPr>
+        <w:pStyle w:val="FirstParagraph"/>
+      </w:pPr>
+      <w:r>
+        <w:rPr>
+          <w:iCs/>
+          <w:i/>
+        </w:rPr>
+        <w:t xml:space="preserve">[To be completed once the Review 2 panel’s written comments are available — this section will map each comment to the specific change made in response, per the course’s general guideline that</w:t>
+      </w:r>
+      <w:r>
+        <w:rPr>
+          <w:iCs/>
+          <w:i/>
+        </w:rPr>
+        <w:t xml:space="preserve"> </w:t>
+      </w:r>
+      <w:r>
+        <w:rPr>
+          <w:iCs/>
+          <w:i/>
+        </w:rPr>
+        <w:t xml:space="preserve">“</w:t>
+      </w:r>
+      <w:r>
+        <w:rPr>
+          <w:iCs/>
+          <w:i/>
+        </w:rPr>
+        <w:t xml:space="preserve">all review comments and suggestions shall be recorded, and the action taken shall be presented during the subsequent review.</w:t>
+      </w:r>
+      <w:r>
+        <w:rPr>
+          <w:iCs/>
+          <w:i/>
+        </w:rPr>
+        <w:t xml:space="preserve">”</w:t>
+      </w:r>
+      <w:r>
+        <w:rPr>
+          <w:iCs/>
+          <w:i/>
+        </w:rPr>
+        <w:t xml:space="preserve">]</w:t>
+      </w:r>
+    </w:p>
+    <w:bookmarkEnd w:id="86"/>
+    <w:bookmarkStart w:id="87" w:name="X8cf3c6e89f48c289956c93d9330524db10bb5f8"/>
+    <w:p>
+      <w:pPr>
+        <w:pStyle w:val="Heading2"/>
+      </w:pPr>
+      <w:r>
+        <w:t xml:space="preserve">4.8 Severity Scoring, Findings Store, and Remediation Generation</w:t>
+      </w:r>
+    </w:p>
+    <w:p>
+      <w:pPr>
+        <w:pStyle w:val="FirstParagraph"/>
+      </w:pPr>
+      <w:r>
+        <w:t xml:space="preserve">Three further modules were added after the initial Review 3 submission, bringing implementation from 5/10 to 8/10 designed modules. All three are real, running, tested code — not stubs — but two involve a documented technology substitution forced by this build environment, disclosed here with the same honesty this report has used for the embedding-model substitution in §4.2.</w:t>
+      </w:r>
+    </w:p>
+    <w:p>
+      <w:pPr>
+        <w:pStyle w:val="BodyText"/>
+      </w:pPr>
+      <w:r>
+        <w:rPr>
+          <w:bCs/>
+          <w:b/>
+        </w:rPr>
+        <w:t xml:space="preserve">Severity Scoring</w:t>
+      </w:r>
+      <w:r>
+        <w:t xml:space="preserve"> </w:t>
+      </w:r>
+      <w:r>
+        <w:t xml:space="preserve">(</w:t>
+      </w:r>
+      <w:r>
+        <w:rPr>
+          <w:rStyle w:val="VerbatimChar"/>
+        </w:rPr>
+        <w:t xml:space="preserve">severity/scorer.py</w:t>
+      </w:r>
+      <w:r>
+        <w:t xml:space="preserve">) is rule-based and CVSS-inspired, exactly as committed in §3.3/§3.6 — this module was never meant to depend on the LLM verdict step, so no substitution was needed here. It combines two signals: (1) a per-CWE/per-OWASP-category reference severity band and score, built from the same 35-entry knowledge base used for retrieval (Critical/High/Medium/Low bands following standard CVSS v3.1 score ranges); and (2) a retrieval-confidence adjustment. For (2), the raw top-1 cosine similarity score was tried first and found uninformative — it clusters tightly in the 0.85–0.95 range regardless of whether the match is correct, an artifact of the GloVe/IDF averaging in §4.2. Instead, the</w:t>
+      </w:r>
+      <w:r>
+        <w:t xml:space="preserve"> </w:t>
+      </w:r>
+      <w:r>
+        <w:rPr>
+          <w:bCs/>
+          <w:b/>
+        </w:rPr>
+        <w:t xml:space="preserve">margin between the top-1 and top-2 Security KB search results</w:t>
+      </w:r>
+      <w:r>
+        <w:t xml:space="preserve"> </w:t>
+      </w:r>
+      <w:r>
+        <w:t xml:space="preserve">was measured directly against the existing 22-snippet benchmark (§4.4): mean margin was 0.0424 when the top-1 match was correct, versus 0.0094 when it was wrong. A threshold of 0.015 (near the midpoint) was chosen from this data; a finding whose margin falls below it has its severity band downgraded one step and is flagged</w:t>
+      </w:r>
+      <w:r>
+        <w:t xml:space="preserve"> </w:t>
+      </w:r>
+      <w:r>
+        <w:rPr>
+          <w:rStyle w:val="VerbatimChar"/>
+        </w:rPr>
+        <w:t xml:space="preserve">low_confidence</w:t>
+      </w:r>
+      <w:r>
+        <w:t xml:space="preserve"> </w:t>
+      </w:r>
+      <w:r>
+        <w:t xml:space="preserve">for manual/LLM review, rather than silently asserting a severity the retrieval step was not confident about.</w:t>
+      </w:r>
+    </w:p>
+    <w:p>
+      <w:pPr>
+        <w:pStyle w:val="BodyText"/>
+      </w:pPr>
+      <w:r>
+        <w:rPr>
+          <w:bCs/>
+          <w:b/>
+        </w:rPr>
+        <w:t xml:space="preserve">Findings Store</w:t>
+      </w:r>
+      <w:r>
+        <w:t xml:space="preserve"> </w:t>
+      </w:r>
+      <w:r>
+        <w:t xml:space="preserve">(</w:t>
+      </w:r>
+      <w:r>
+        <w:rPr>
+          <w:rStyle w:val="VerbatimChar"/>
+        </w:rPr>
+        <w:t xml:space="preserve">findings_store/store.py</w:t>
+      </w:r>
+      <w:r>
+        <w:t xml:space="preserve">) persists each scored finding (repo, file, line range, CWE/OWASP match, severity, confidence margin, rationale, retrieved KB context) so results can be queried and filtered without re-running the pipeline. Chapter 3’s tech-stack list named MongoDB as one option to decide between during implementation (§3.4); this build environment has no installable MongoDB server package (confirmed via</w:t>
+      </w:r>
+      <w:r>
+        <w:t xml:space="preserve"> </w:t>
+      </w:r>
+      <w:r>
+        <w:rPr>
+          <w:rStyle w:val="VerbatimChar"/>
+        </w:rPr>
+        <w:t xml:space="preserve">apt-cache search mongodb</w:t>
+      </w:r>
+      <w:r>
+        <w:t xml:space="preserve">, which returns only client-library bindings). Rather than skip the module, it uses Python’s stdlib</w:t>
+      </w:r>
+      <w:r>
+        <w:t xml:space="preserve"> </w:t>
+      </w:r>
+      <w:r>
+        <w:rPr>
+          <w:rStyle w:val="VerbatimChar"/>
+        </w:rPr>
+        <w:t xml:space="preserve">sqlite3</w:t>
+      </w:r>
+      <w:r>
+        <w:t xml:space="preserve"> </w:t>
+      </w:r>
+      <w:r>
+        <w:t xml:space="preserve">— a real, working, zero-extra-dependency substitute. The schema is deliberately document-shaped (one row per finding, JSON column for the nested KB-context list) so a later move to MongoDB, if still wanted for Project II, is a straightforward mapping rather than a redesign.</w:t>
+      </w:r>
+    </w:p>
+    <w:p>
+      <w:pPr>
+        <w:pStyle w:val="BodyText"/>
+      </w:pPr>
+      <w:r>
+        <w:rPr>
+          <w:bCs/>
+          <w:b/>
+        </w:rPr>
+        <w:t xml:space="preserve">Remediation Generation</w:t>
+      </w:r>
+      <w:r>
+        <w:t xml:space="preserve"> </w:t>
+      </w:r>
+      <w:r>
+        <w:t xml:space="preserve">(</w:t>
+      </w:r>
+      <w:r>
+        <w:rPr>
+          <w:rStyle w:val="VerbatimChar"/>
+        </w:rPr>
+        <w:t xml:space="preserve">remediation/generator.py</w:t>
+      </w:r>
+      <w:r>
+        <w:t xml:space="preserve">) was originally envisioned as LLM-generated (§3.3), which needs an LLM API this sandbox cannot reach for this sprint — the same network constraint already documented for the embedding model (§4.2), not a new one. As a real, working substitute, this module implements a</w:t>
+      </w:r>
+      <w:r>
+        <w:t xml:space="preserve"> </w:t>
+      </w:r>
+      <w:r>
+        <w:rPr>
+          <w:bCs/>
+          <w:b/>
+        </w:rPr>
+        <w:t xml:space="preserve">template-based, CWE-keyed generator</w:t>
+      </w:r>
+      <w:r>
+        <w:t xml:space="preserve">: for 7 of the 25 CWE Top 25:2025 categories with a well-established, mechanical fix pattern (e.g. parameterised queries for CWE-89 SQL Injection,</w:t>
+      </w:r>
+      <w:r>
+        <w:t xml:space="preserve"> </w:t>
+      </w:r>
+      <w:r>
+        <w:rPr>
+          <w:rStyle w:val="VerbatimChar"/>
+        </w:rPr>
+        <w:t xml:space="preserve">shell=False</w:t>
+      </w:r>
+      <w:r>
+        <w:t xml:space="preserve"> </w:t>
+      </w:r>
+      <w:r>
+        <w:t xml:space="preserve">with an argument list for CWE-78 OS Command Injection, a resolved-path/</w:t>
+      </w:r>
+      <w:r>
+        <w:rPr>
+          <w:rStyle w:val="VerbatimChar"/>
+        </w:rPr>
+        <w:t xml:space="preserve">commonpath</w:t>
+      </w:r>
+      <w:r>
+        <w:t xml:space="preserve"> </w:t>
+      </w:r>
+      <w:r>
+        <w:t xml:space="preserve">check for CWE-22 Path Traversal), it returns a genuine before/after code pair plus a plain-language explanation. The remaining 18 categories — mostly ones needing judgment about business logic or authentication/authorization flow (e.g. CWE-306 Missing Authentication, CWE-863 Incorrect Authorization) rather than a mechanical rewrite — are explicitly listed as having no template and return</w:t>
+      </w:r>
+      <w:r>
+        <w:t xml:space="preserve"> </w:t>
+      </w:r>
+      <w:r>
+        <w:rPr>
+          <w:rStyle w:val="VerbatimChar"/>
+        </w:rPr>
+        <w:t xml:space="preserve">None</w:t>
+      </w:r>
+      <w:r>
+        <w:t xml:space="preserve"> </w:t>
+      </w:r>
+      <w:r>
+        <w:t xml:space="preserve">rather than a guessed fix. This split is itself evidence the substitution is honest about its limits: it does what a template can do, and says so where it can’t. As Chapter 3 already committed (§3.6 design principle carried from Review 2), every remediation is a suggestion for developer review, never auto-applied.</w:t>
+      </w:r>
+    </w:p>
+    <w:p>
+      <w:pPr>
+        <w:pStyle w:val="BodyText"/>
+      </w:pPr>
+      <w:r>
+        <w:rPr>
+          <w:bCs/>
+          <w:b/>
+        </w:rPr>
+        <w:t xml:space="preserve">End-to-end run.</w:t>
+      </w:r>
+      <w:r>
+        <w:t xml:space="preserve"> </w:t>
+      </w:r>
+      <w:r>
+        <w:rPr>
+          <w:rStyle w:val="VerbatimChar"/>
+        </w:rPr>
+        <w:t xml:space="preserve">pipeline/full_scan.py</w:t>
+      </w:r>
+      <w:r>
+        <w:t xml:space="preserve"> </w:t>
+      </w:r>
+      <w:r>
+        <w:t xml:space="preserve">wires all three new modules onto the existing retrieval pipeline (Ingestion → Chunking → Embedding → KB → Retrieval →</w:t>
+      </w:r>
+      <w:r>
+        <w:t xml:space="preserve"> </w:t>
+      </w:r>
+      <w:r>
+        <w:rPr>
+          <w:bCs/>
+          <w:b/>
+        </w:rPr>
+        <w:t xml:space="preserve">Severity Scoring → Findings Store → Remediation Generation</w:t>
+      </w:r>
+      <w:r>
+        <w:t xml:space="preserve">) and was run against the same real repository as §4.3 (OWASP/NodeGoat). Of 8 sampled code chunks, the pipeline produced 8 stored candidate findings with a severity breakdown of 4 High, 3 Medium, 1 Low; 2 of the 8 matched a CWE with a remediation template available. Full output is in</w:t>
+      </w:r>
+      <w:r>
+        <w:t xml:space="preserve"> </w:t>
+      </w:r>
+      <w:r>
+        <w:rPr>
+          <w:rStyle w:val="VerbatimChar"/>
+        </w:rPr>
+        <w:t xml:space="preserve">results/full_scan_report.json</w:t>
+      </w:r>
+      <w:r>
+        <w:t xml:space="preserve">.</w:t>
+      </w:r>
+    </w:p>
+    <w:p>
+      <w:pPr>
+        <w:pStyle w:val="BodyText"/>
+      </w:pPr>
+      <w:r>
+        <w:rPr>
+          <w:bCs/>
+          <w:b/>
+        </w:rPr>
+        <w:t xml:space="preserve">Candidate findings, not verified vulnerabilities.</w:t>
+      </w:r>
+      <w:r>
+        <w:t xml:space="preserve"> </w:t>
+      </w:r>
+      <w:r>
+        <w:t xml:space="preserve">Every row this pipeline scores, stores, and generates a remediation for is a</w:t>
+      </w:r>
+      <w:r>
+        <w:t xml:space="preserve"> </w:t>
+      </w:r>
+      <w:r>
+        <w:rPr>
+          <w:iCs/>
+          <w:i/>
+        </w:rPr>
+        <w:t xml:space="preserve">candidate</w:t>
+      </w:r>
+      <w:r>
+        <w:t xml:space="preserve"> </w:t>
+      </w:r>
+      <w:r>
+        <w:t xml:space="preserve">finding: a code chunk paired with its nearest Security Knowledge Base match, scored and remediated as if that match were a true positive. None of this has been confirmed by code reading the way the (not-yet-built) LLM Security Analysis module would — this is a deliberate scope boundary, not an oversight, and mirrors how a traditional SAST tool’s raw output is a list of candidates for triage rather than a list of confirmed vulnerabilities. Framing severity/remediation output honestly this way, ahead of building the confirmation step, was judged more useful for this review than waiting to show nothing until the LLM stage existed.</w:t>
+      </w:r>
+    </w:p>
+    <w:bookmarkEnd w:id="87"/>
+    <w:bookmarkStart w:id="88" w:name="limitations-and-next-steps-into-review-4"/>
+    <w:p>
+      <w:pPr>
+        <w:pStyle w:val="Heading2"/>
+      </w:pPr>
+      <w:r>
+        <w:t xml:space="preserve">4.9 Limitations and Next Steps (into Review 4)</w:t>
+      </w:r>
+    </w:p>
+    <w:p>
+      <w:pPr>
+        <w:numPr>
+          <w:ilvl w:val="0"/>
+          <w:numId w:val="1011"/>
+        </w:numPr>
+        <w:pStyle w:val="Compact"/>
+      </w:pPr>
+      <w:r>
+        <w:t xml:space="preserve">The embedding backbone (§4.2) is a documented, swappable substitute for the code-specialised transformer named in Chapter 3; Review 4 should attempt that swap and re-run §4.4’s exact benchmark to measure the improvement.</w:t>
+      </w:r>
+    </w:p>
+    <w:p>
+      <w:pPr>
+        <w:numPr>
+          <w:ilvl w:val="0"/>
+          <w:numId w:val="1011"/>
+        </w:numPr>
+        <w:pStyle w:val="Compact"/>
+      </w:pPr>
+      <w:r>
+        <w:t xml:space="preserve">Chunking currently treats a</w:t>
+      </w:r>
+      <w:r>
+        <w:t xml:space="preserve"> </w:t>
+      </w:r>
+      <w:r>
+        <w:rPr>
+          <w:rStyle w:val="VerbatimChar"/>
+        </w:rPr>
+        <w:t xml:space="preserve">module.exports = function(){...}</w:t>
+      </w:r>
+      <w:r>
+        <w:t xml:space="preserve"> </w:t>
+      </w:r>
+      <w:r>
+        <w:t xml:space="preserve">wrapper as one chunk; splitting on inner method definitions would reduce chunk-size variance for older CommonJS-style code (§4.3).</w:t>
+      </w:r>
+    </w:p>
+    <w:p>
+      <w:pPr>
+        <w:numPr>
+          <w:ilvl w:val="0"/>
+          <w:numId w:val="1011"/>
+        </w:numPr>
+        <w:pStyle w:val="Compact"/>
+      </w:pPr>
+      <w:r>
+        <w:t xml:space="preserve">The access-control CWE family (§4.4) is the clearest, most specific target for the LLM reasoning layer’s first use: distinguishing</w:t>
+      </w:r>
+      <w:r>
+        <w:t xml:space="preserve"> </w:t>
+      </w:r>
+      <w:r>
+        <w:t xml:space="preserve">“</w:t>
+      </w:r>
+      <w:r>
+        <w:t xml:space="preserve">no check present</w:t>
+      </w:r>
+      <w:r>
+        <w:t xml:space="preserve">”</w:t>
+      </w:r>
+      <w:r>
+        <w:t xml:space="preserve"> </w:t>
+      </w:r>
+      <w:r>
+        <w:t xml:space="preserve">from</w:t>
+      </w:r>
+      <w:r>
+        <w:t xml:space="preserve"> </w:t>
+      </w:r>
+      <w:r>
+        <w:t xml:space="preserve">“</w:t>
+      </w:r>
+      <w:r>
+        <w:t xml:space="preserve">check present but wrong,</w:t>
+      </w:r>
+      <w:r>
+        <w:t xml:space="preserve">”</w:t>
+      </w:r>
+      <w:r>
+        <w:t xml:space="preserve"> </w:t>
+      </w:r>
+      <w:r>
+        <w:t xml:space="preserve">which the current retrieval-only baseline cannot do — and, per §4.8, is also the source of most of this sprint’s</w:t>
+      </w:r>
+      <w:r>
+        <w:t xml:space="preserve"> </w:t>
+      </w:r>
+      <w:r>
+        <w:rPr>
+          <w:rStyle w:val="VerbatimChar"/>
+        </w:rPr>
+        <w:t xml:space="preserve">low_confidence</w:t>
+      </w:r>
+      <w:r>
+        <w:t xml:space="preserve"> </w:t>
+      </w:r>
+      <w:r>
+        <w:t xml:space="preserve">flags, so the two limitations are linked.</w:t>
+      </w:r>
+    </w:p>
+    <w:p>
+      <w:pPr>
+        <w:numPr>
+          <w:ilvl w:val="0"/>
+          <w:numId w:val="1011"/>
+        </w:numPr>
+        <w:pStyle w:val="Compact"/>
+      </w:pPr>
+      <w:r>
+        <w:t xml:space="preserve">Remediation template coverage (§4.8) is 7 of 25 CWE categories; extending coverage further is mechanical, but the remaining categories mostly need the LLM reasoning step rather than more templates.</w:t>
+      </w:r>
+    </w:p>
+    <w:p>
+      <w:pPr>
+        <w:numPr>
+          <w:ilvl w:val="0"/>
+          <w:numId w:val="1011"/>
+        </w:numPr>
+        <w:pStyle w:val="Compact"/>
+      </w:pPr>
+      <w:r>
         <w:t xml:space="preserve">Current scope is Python/JS/TS only (§1.4); the 46</w:t>
       </w:r>
       <w:r>
@@ -7461,8 +7983,20 @@
         <w:t xml:space="preserve">files counted in §4.3 (e.g. NodeGoat’s HTML/CSS/JSON assets) are retained but unprocessed, ready for future-scope language additions (§3.8) rather than discarded.</w:t>
       </w:r>
     </w:p>
-    <w:bookmarkEnd w:id="87"/>
-    <w:bookmarkStart w:id="91" w:name="appendix-a-system-architecture-diagram"/>
+    <w:p>
+      <w:pPr>
+        <w:numPr>
+          <w:ilvl w:val="0"/>
+          <w:numId w:val="1011"/>
+        </w:numPr>
+        <w:pStyle w:val="Compact"/>
+      </w:pPr>
+      <w:r>
+        <w:t xml:space="preserve">Review 4 priority order, given the above: (1) LLM Security Analysis — the single module that would let every candidate finding above become a verified one; (2) the embedding-model swap; (3) a minimal Dashboard over the Findings Store.</w:t>
+      </w:r>
+    </w:p>
+    <w:bookmarkEnd w:id="88"/>
+    <w:bookmarkStart w:id="92" w:name="appendix-a-system-architecture-diagram"/>
     <w:p>
       <w:pPr>
         <w:pStyle w:val="Heading2"/>
@@ -7480,18 +8014,18 @@
           <wp:inline>
             <wp:extent cx="5334000" cy="7333455"/>
             <wp:effectExtent b="0" l="0" r="0" t="0"/>
-            <wp:docPr descr="System Architecture" title="" id="89" name="Picture"/>
+            <wp:docPr descr="System Architecture" title="" id="90" name="Picture"/>
             <a:graphic>
               <a:graphicData uri="http://schemas.openxmlformats.org/drawingml/2006/picture">
                 <pic:pic>
                   <pic:nvPicPr>
-                    <pic:cNvPr descr="../design/architecture_diagram.png" id="90" name="Picture"/>
+                    <pic:cNvPr descr="../design/architecture_diagram.png" id="91" name="Picture"/>
                     <pic:cNvPicPr>
                       <a:picLocks noChangeArrowheads="1" noChangeAspect="1"/>
                     </pic:cNvPicPr>
                   </pic:nvPicPr>
                   <pic:blipFill>
-                    <a:blip r:embed="rId88"/>
+                    <a:blip r:embed="rId89"/>
                     <a:stretch>
                       <a:fillRect/>
                     </a:stretch>
@@ -7538,8 +8072,8 @@
         <w:t xml:space="preserve">Figure A.1 — End-to-end architecture: ingestion, dual-context RAG retrieval (repository code index + OWASP/CWE knowledge base), LLM-based analysis, rule-based severity scoring, remediation generation, and dashboard presentation.</w:t>
       </w:r>
     </w:p>
-    <w:bookmarkEnd w:id="91"/>
-    <w:bookmarkStart w:id="96" w:name="Xff3c4e9f2ae5a9e5667ddf30d09480f6419997d"/>
+    <w:bookmarkEnd w:id="92"/>
+    <w:bookmarkStart w:id="97" w:name="Xff3c4e9f2ae5a9e5667ddf30d09480f6419997d"/>
     <w:p>
       <w:pPr>
         <w:pStyle w:val="Heading2"/>
@@ -7552,7 +8086,7 @@
       <w:pPr>
         <w:numPr>
           <w:ilvl w:val="0"/>
-          <w:numId w:val="1011"/>
+          <w:numId w:val="1012"/>
         </w:numPr>
         <w:pStyle w:val="Compact"/>
       </w:pPr>
@@ -7574,7 +8108,7 @@
       <w:r>
         <w:t xml:space="preserve"> </w:t>
       </w:r>
-      <w:hyperlink r:id="rId92">
+      <w:hyperlink r:id="rId93">
         <w:r>
           <w:rPr>
             <w:rStyle w:val="Hyperlink"/>
@@ -7593,7 +8127,7 @@
       <w:pPr>
         <w:numPr>
           <w:ilvl w:val="0"/>
-          <w:numId w:val="1011"/>
+          <w:numId w:val="1012"/>
         </w:numPr>
         <w:pStyle w:val="Compact"/>
       </w:pPr>
@@ -7615,7 +8149,7 @@
       <w:r>
         <w:t xml:space="preserve"> </w:t>
       </w:r>
-      <w:hyperlink r:id="rId93">
+      <w:hyperlink r:id="rId94">
         <w:r>
           <w:rPr>
             <w:rStyle w:val="Hyperlink"/>
@@ -7634,7 +8168,7 @@
       <w:pPr>
         <w:numPr>
           <w:ilvl w:val="0"/>
-          <w:numId w:val="1011"/>
+          <w:numId w:val="1012"/>
         </w:numPr>
         <w:pStyle w:val="Compact"/>
       </w:pPr>
@@ -7656,7 +8190,7 @@
       <w:r>
         <w:t xml:space="preserve"> </w:t>
       </w:r>
-      <w:hyperlink r:id="rId94">
+      <w:hyperlink r:id="rId95">
         <w:r>
           <w:rPr>
             <w:rStyle w:val="Hyperlink"/>
@@ -7672,7 +8206,7 @@
       <w:pPr>
         <w:numPr>
           <w:ilvl w:val="0"/>
-          <w:numId w:val="1011"/>
+          <w:numId w:val="1012"/>
         </w:numPr>
         <w:pStyle w:val="Compact"/>
       </w:pPr>
@@ -7694,7 +8228,7 @@
       <w:r>
         <w:t xml:space="preserve"> </w:t>
       </w:r>
-      <w:hyperlink r:id="rId95">
+      <w:hyperlink r:id="rId96">
         <w:r>
           <w:rPr>
             <w:rStyle w:val="Hyperlink"/>
@@ -7710,7 +8244,7 @@
       <w:pPr>
         <w:numPr>
           <w:ilvl w:val="0"/>
-          <w:numId w:val="1011"/>
+          <w:numId w:val="1012"/>
         </w:numPr>
         <w:pStyle w:val="Compact"/>
       </w:pPr>
@@ -7784,8 +8318,8 @@
         <w:t xml:space="preserve">(See Chapter 2, Section 2.8 for the full list of 20 literature references reviewed for this project.)</w:t>
       </w:r>
     </w:p>
-    <w:bookmarkEnd w:id="96"/>
     <w:bookmarkEnd w:id="97"/>
+    <w:bookmarkEnd w:id="98"/>
     <w:sectPr/>
   </w:body>
 </w:document>
@@ -8222,6 +8756,9 @@
     <w:abstractNumId w:val="991"/>
   </w:num>
   <w:num w:numId="1011">
+    <w:abstractNumId w:val="991"/>
+  </w:num>
+  <w:num w:numId="1012">
     <w:abstractNumId w:val="99411"/>
     <w:lvlOverride w:ilvl="0">
       <w:startOverride w:val="1"/>

</xml_diff>